<commit_message>
Reformatar honorários do contrato de compra e venda em itens lettered (a, b, c...)
- gerar.ts: monta array Honorarios com ordem fixa (parceria > corretor(es) > imobiliária própria), mescla corretor único quando proprietário e contraparte são a mesma pessoa, e inclui dados bancários fixos da imobiliária (Sicredi 748, Ag 0821, Conta 75738-8, CNPJ 30.902.268/0002-60)
- contrato_compra_venda.docx: substitui {{TextoHonorarios}} por loop real {{#Honorarios}}...{{/Honorarios}} com negrito verdadeiro na linha Valor
- campos.ts: documenta o novo campo Honorarios (loop) no lugar do TextoHonorarios antigo
</commit_message>
<xml_diff>
--- a/templates/contrato_compra_venda.docx
+++ b/templates/contrato_compra_venda.docx
@@ -830,7 +830,7 @@
     </w:p>
     <w:p>
       <w:pPr>
-        <w:spacing w:after="240" w:line="360" w:lineRule="auto"/>
+        <w:spacing w:after="0" w:line="360" w:lineRule="auto"/>
         <w:ind w:left="1133.858267716535" w:firstLine="0"/>
         <w:jc w:val="both"/>
         <w:rPr>
@@ -840,11 +840,87 @@
       </w:pPr>
       <w:r>
         <w:rPr>
-          <w:sz w:val="24"/>
-          <w:szCs w:val="24"/>
-          <w:rtl w:val="0"/>
-        </w:rPr>
-        <w:t xml:space="preserve">{{TextoHonorarios}}</w:t>
+          <w:rtl w:val="0"/>
+        </w:rPr>
+        <w:t xml:space="preserve">{{#Honorarios}}</w:t>
+      </w:r>
+    </w:p>
+    <w:p>
+      <w:pPr>
+        <w:spacing w:after="0" w:line="360" w:lineRule="auto"/>
+        <w:ind w:left="1133.858267716535" w:firstLine="0"/>
+        <w:jc w:val="both"/>
+        <w:rPr>
+          <w:sz w:val="24"/>
+          <w:szCs w:val="24"/>
+        </w:rPr>
+      </w:pPr>
+      <w:r>
+        <w:rPr>
+          <w:sz w:val="24"/>
+          <w:szCs w:val="24"/>
+          <w:rtl w:val="0"/>
+        </w:rPr>
+        <w:t xml:space="preserve">{{Letra}}) {{Titulo}}</w:t>
+      </w:r>
+    </w:p>
+    <w:p>
+      <w:pPr>
+        <w:spacing w:after="0" w:line="360" w:lineRule="auto"/>
+        <w:ind w:left="1133.858267716535" w:firstLine="0"/>
+        <w:jc w:val="both"/>
+        <w:rPr>
+          <w:sz w:val="24"/>
+          <w:szCs w:val="24"/>
+        </w:rPr>
+      </w:pPr>
+      <w:r>
+        <w:rPr>
+          <w:sz w:val="24"/>
+          <w:szCs w:val="24"/>
+          <w:rtl w:val="0"/>
+        </w:rPr>
+        <w:t xml:space="preserve">{{Detalhes}}</w:t>
+      </w:r>
+    </w:p>
+    <w:p>
+      <w:pPr>
+        <w:spacing w:after="240" w:line="360" w:lineRule="auto"/>
+        <w:ind w:left="1133.858267716535" w:firstLine="0"/>
+        <w:jc w:val="both"/>
+        <w:rPr>
+          <w:b w:val="1"/>
+          <w:bCs w:val="1"/>
+          <w:sz w:val="24"/>
+          <w:szCs w:val="24"/>
+        </w:rPr>
+      </w:pPr>
+      <w:r>
+        <w:rPr>
+          <w:b w:val="1"/>
+          <w:bCs w:val="1"/>
+          <w:sz w:val="24"/>
+          <w:szCs w:val="24"/>
+          <w:rtl w:val="0"/>
+        </w:rPr>
+        <w:t xml:space="preserve">Valor: {{ValorTexto}}</w:t>
+      </w:r>
+    </w:p>
+    <w:p>
+      <w:pPr>
+        <w:spacing w:after="0" w:line="360" w:lineRule="auto"/>
+        <w:ind w:left="1133.858267716535" w:firstLine="0"/>
+        <w:jc w:val="both"/>
+        <w:rPr>
+          <w:sz w:val="24"/>
+          <w:szCs w:val="24"/>
+        </w:rPr>
+      </w:pPr>
+      <w:r>
+        <w:rPr>
+          <w:rtl w:val="0"/>
+        </w:rPr>
+        <w:t xml:space="preserve">{{/Honorarios}}</w:t>
       </w:r>
     </w:p>
     <w:p>

</xml_diff>